<commit_message>
paper: complete author-confirmed SoftwareX declarations
</commit_message>
<xml_diff>
--- a/paper-softwarex/manuscript-v0.9.docx
+++ b/paper-softwarex/manuscript-v0.9.docx
@@ -1024,7 +1024,7 @@
           <w:szCs w:val="22"/>
           <w:b w:val="0"/>
         </w:rPr>
-        <w:t xml:space="preserve">Figure 1. Local GPU Imagegen architecture. Solid arrows show control relationships; dashed arrows show retained-record access. The exporter and checker are source-only supplements; the backend and models are user supplied. OpenAI Codex assisted in drafting the diagram specification and rendering code; its exact model version is pending confirmation.</w:t>
+        <w:t xml:space="preserve">Figure 1. Local GPU Imagegen architecture. Solid arrows show control relationships; dashed arrows show retained-record access. The exporter and checker are source-only supplements; the backend and models are user supplied. OpenAI Codex (GPT-6.1 Sol) assisted in drafting the diagram specification and rendering code.</w:t>
       </w:r>
     </w:p>
     <w:p>
@@ -2209,7 +2209,7 @@
           <w:szCs w:val="22"/>
           <w:b w:val="0"/>
         </w:rPr>
-        <w:t xml:space="preserve">Figure 2. CPU engine fixture with a retained job identifier. Retrieval exposes the recovery action; same-key/hash re-entry forwards the identifier and records a generated round. The stop-only branch takes no further action. The separate HTTP-adapter check queries history/view with zero prompt POSTs. OpenAI Codex assisted in drafting the schematic and Python rendering code; its exact model version is pending confirmation.</w:t>
+        <w:t xml:space="preserve">Figure 2. CPU engine fixture with a retained job identifier. Retrieval exposes the recovery action; same-key/hash re-entry forwards the identifier and records a generated round. The stop-only branch takes no further action. The separate HTTP-adapter check queries history/view with zero prompt POSTs. OpenAI Codex (GPT-6.1 Sol) assisted in drafting the schematic and Python rendering code.</w:t>
       </w:r>
     </w:p>
     <w:p>
@@ -2453,7 +2453,7 @@
           <w:szCs w:val="22"/>
           <w:b w:val="0"/>
         </w:rPr>
-        <w:t xml:space="preserve">Codex also assisted in drafting the explanatory diagram specifications and rendering code. The retained specifications and code render Figures 1 and 2. The exact model versions used for this assistance are pending confirmation before submission.</w:t>
+        <w:t xml:space="preserve">For the explanatory diagrams, OpenAI Codex (GPT-6.1 Sol) assisted in drafting the specifications and rendering code. The retained specifications and code render Figures 1 and 2.</w:t>
       </w:r>
     </w:p>
     <w:p>
@@ -2482,6 +2482,90 @@
           <w:b w:val="0"/>
         </w:rPr>
         <w:t xml:space="preserve">This research received no specific grant from funding agencies in the public, commercial, or not-for-profit sectors. The author completed the work independently.</w:t>
+      </w:r>
+    </w:p>
+    <w:p>
+      <w:pPr>
+        <w:pStyle w:val="Heading1"/>
+        <w:spacing w:before="0" w:line="240" w:lineRule="auto"/>
+      </w:pPr>
+      <w:r>
+        <w:rPr>
+          <w:rFonts w:ascii="Arial" w:eastAsia="Calibri" w:hAnsi="Arial" w:cs="Arial"/>
+          <w:sz w:val="22"/>
+          <w:szCs w:val="22"/>
+          <w:b w:val="1"/>
+        </w:rPr>
+        <w:t xml:space="preserve">Declaration of competing interests</w:t>
+      </w:r>
+    </w:p>
+    <w:p>
+      <w:pPr>
+        <w:spacing w:after="0" w:line="240" w:lineRule="auto"/>
+      </w:pPr>
+      <w:r>
+        <w:rPr>
+          <w:rFonts w:ascii="Arial" w:hAnsi="Arial" w:cs="Arial"/>
+          <w:szCs w:val="22"/>
+          <w:b w:val="0"/>
+        </w:rPr>
+        <w:t xml:space="preserve">The author declares no competing financial interests or personal relationships that could have appeared to influence the work reported in this paper.</w:t>
+      </w:r>
+    </w:p>
+    <w:p>
+      <w:pPr>
+        <w:pStyle w:val="Heading1"/>
+        <w:spacing w:before="0" w:line="240" w:lineRule="auto"/>
+      </w:pPr>
+      <w:r>
+        <w:rPr>
+          <w:rFonts w:ascii="Arial" w:eastAsia="Calibri" w:hAnsi="Arial" w:cs="Arial"/>
+          <w:sz w:val="22"/>
+          <w:szCs w:val="22"/>
+          <w:b w:val="1"/>
+        </w:rPr>
+        <w:t xml:space="preserve">CRediT authorship contribution statement</w:t>
+      </w:r>
+    </w:p>
+    <w:p>
+      <w:pPr>
+        <w:spacing w:after="0" w:line="240" w:lineRule="auto"/>
+      </w:pPr>
+      <w:r>
+        <w:rPr>
+          <w:rFonts w:ascii="Arial" w:hAnsi="Arial" w:cs="Arial"/>
+          <w:szCs w:val="22"/>
+          <w:b w:val="0"/>
+        </w:rPr>
+        <w:t xml:space="preserve">Zhen Cheng: Conceptualization, Methodology, Software, Investigation, Validation, Data curation, Writing – original draft, Writing – review &amp; editing.</w:t>
+      </w:r>
+    </w:p>
+    <w:p>
+      <w:pPr>
+        <w:pStyle w:val="Heading1"/>
+        <w:spacing w:before="0" w:line="240" w:lineRule="auto"/>
+      </w:pPr>
+      <w:r>
+        <w:rPr>
+          <w:rFonts w:ascii="Arial" w:eastAsia="Calibri" w:hAnsi="Arial" w:cs="Arial"/>
+          <w:sz w:val="22"/>
+          <w:szCs w:val="22"/>
+          <w:b w:val="1"/>
+        </w:rPr>
+        <w:t xml:space="preserve">Ethics and consent</w:t>
+      </w:r>
+    </w:p>
+    <w:p>
+      <w:pPr>
+        <w:spacing w:after="0" w:line="240" w:lineRule="auto"/>
+      </w:pPr>
+      <w:r>
+        <w:rPr>
+          <w:rFonts w:ascii="Arial" w:hAnsi="Arial" w:cs="Arial"/>
+          <w:szCs w:val="22"/>
+          <w:b w:val="0"/>
+        </w:rPr>
+        <w:t xml:space="preserve">This study did not involve human participants, identifiable personal data, or animal experiments.</w:t>
       </w:r>
     </w:p>
     <w:p>

</xml_diff>